<commit_message>
Camill Buch und Story 10 udpate
</commit_message>
<xml_diff>
--- a/docs/Buch Camille Chronicles/Melodies.docx
+++ b/docs/Buch Camille Chronicles/Melodies.docx
@@ -26,89 +26,33 @@
         <w:rPr>
           <w:lang w:val="en-US"/>
         </w:rPr>
-        <w:t xml:space="preserve">Melodies are a short assortment of tones that activate the </w:t>
-      </w:r>
-      <w:proofErr w:type="spellStart"/>
-      <w:r>
-        <w:rPr>
-          <w:lang w:val="en-US"/>
-        </w:rPr>
-        <w:t>Soulstice</w:t>
-      </w:r>
-      <w:proofErr w:type="spellEnd"/>
-      <w:r>
-        <w:rPr>
-          <w:lang w:val="en-US"/>
-        </w:rPr>
-        <w:t xml:space="preserve"> powers between Harmonist and Stice. </w:t>
-      </w:r>
-    </w:p>
-    <w:p>
-      <w:pPr>
-        <w:rPr>
-          <w:lang w:val="en-US"/>
-        </w:rPr>
-      </w:pPr>
-      <w:r>
-        <w:rPr>
-          <w:lang w:val="en-US"/>
-        </w:rPr>
-        <w:t xml:space="preserve">Is the bond of trust between Harmonist and Stice perfect, then they might play the Melodies with even greater effect and control, their passive senses and abilities even greater </w:t>
-      </w:r>
-      <w:proofErr w:type="spellStart"/>
-      <w:r>
-        <w:rPr>
-          <w:lang w:val="en-US"/>
-        </w:rPr>
-        <w:t>thatn</w:t>
-      </w:r>
-      <w:proofErr w:type="spellEnd"/>
-      <w:r>
-        <w:rPr>
-          <w:lang w:val="en-US"/>
-        </w:rPr>
-        <w:t xml:space="preserve"> before.</w:t>
-      </w:r>
-    </w:p>
-    <w:p>
-      <w:pPr>
-        <w:rPr>
-          <w:lang w:val="en-US"/>
-        </w:rPr>
-      </w:pPr>
-      <w:r>
-        <w:rPr>
-          <w:lang w:val="en-US"/>
-        </w:rPr>
-        <w:t xml:space="preserve">The Melodies of a specific </w:t>
-      </w:r>
-      <w:proofErr w:type="spellStart"/>
-      <w:r>
-        <w:rPr>
-          <w:lang w:val="en-US"/>
-        </w:rPr>
-        <w:t>Soulstice</w:t>
-      </w:r>
-      <w:proofErr w:type="spellEnd"/>
-      <w:r>
-        <w:rPr>
-          <w:lang w:val="en-US"/>
-        </w:rPr>
-        <w:t xml:space="preserve"> combine into a song that can be added upon in either direction. Though the song does have an end if all Melodies are discovered and learned by a Harmonist and played in the right order right behind each other. Then the Harmonist is truly ascended and can use the song freely to combine powers as they wish as well as gain special specific abilities depending on their </w:t>
-      </w:r>
-      <w:proofErr w:type="spellStart"/>
-      <w:r>
-        <w:rPr>
-          <w:lang w:val="en-US"/>
-        </w:rPr>
-        <w:t>Soulstice</w:t>
-      </w:r>
-      <w:proofErr w:type="spellEnd"/>
-      <w:r>
-        <w:rPr>
-          <w:lang w:val="en-US"/>
-        </w:rPr>
-        <w:t xml:space="preserve"> type.</w:t>
+        <w:t xml:space="preserve">Melodies are a short assortment of tones that activate the Soulstice powers between Harmonist and Stice. </w:t>
+      </w:r>
+    </w:p>
+    <w:p>
+      <w:pPr>
+        <w:rPr>
+          <w:lang w:val="en-US"/>
+        </w:rPr>
+      </w:pPr>
+      <w:r>
+        <w:rPr>
+          <w:lang w:val="en-US"/>
+        </w:rPr>
+        <w:t>Is the bond of trust between Harmonist and Stice perfect, then they might play the Melodies with even greater effect and control, their passive senses and abilities even greater thatn before.</w:t>
+      </w:r>
+    </w:p>
+    <w:p>
+      <w:pPr>
+        <w:rPr>
+          <w:lang w:val="en-US"/>
+        </w:rPr>
+      </w:pPr>
+      <w:r>
+        <w:rPr>
+          <w:lang w:val="en-US"/>
+        </w:rPr>
+        <w:t>The Melodies of a specific Soulstice combine into a song that can be added upon in either direction. Though the song does have an end if all Melodies are discovered and learned by a Harmonist and played in the right order right behind each other. Then the Harmonist is truly ascended and can use the song freely to combine powers as they wish as well as gain special specific abilities depending on their Soulstice type.</w:t>
       </w:r>
     </w:p>
     <w:p>
@@ -118,19 +62,11 @@
           <w:lang w:val="en-US"/>
         </w:rPr>
       </w:pPr>
-      <w:proofErr w:type="spellStart"/>
-      <w:r>
-        <w:rPr>
-          <w:lang w:val="en-US"/>
-        </w:rPr>
-        <w:t>Aikstice</w:t>
-      </w:r>
-      <w:proofErr w:type="spellEnd"/>
-      <w:r>
-        <w:rPr>
-          <w:lang w:val="en-US"/>
-        </w:rPr>
-        <w:t xml:space="preserve"> </w:t>
+      <w:r>
+        <w:rPr>
+          <w:lang w:val="en-US"/>
+        </w:rPr>
+        <w:t xml:space="preserve">Aikstice </w:t>
       </w:r>
     </w:p>
     <w:p>
@@ -210,21 +146,7 @@
         <w:rPr>
           <w:lang w:val="en-US"/>
         </w:rPr>
-        <w:t xml:space="preserve">and anything it </w:t>
-      </w:r>
-      <w:proofErr w:type="gramStart"/>
-      <w:r>
-        <w:rPr>
-          <w:lang w:val="en-US"/>
-        </w:rPr>
-        <w:t>touches</w:t>
-      </w:r>
-      <w:proofErr w:type="gramEnd"/>
-      <w:r>
-        <w:rPr>
-          <w:lang w:val="en-US"/>
-        </w:rPr>
-        <w:t xml:space="preserve"> </w:t>
+        <w:t xml:space="preserve">and anything it touches </w:t>
       </w:r>
       <w:r>
         <w:rPr>
@@ -296,7 +218,19 @@
         <w:rPr>
           <w:lang w:val="en-US"/>
         </w:rPr>
-        <w:t>Increases muscle size, bone density and limb range.</w:t>
+        <w:t>Increases muscle size, bone density and limb range</w:t>
+      </w:r>
+      <w:r>
+        <w:rPr>
+          <w:lang w:val="en-US"/>
+        </w:rPr>
+        <w:t xml:space="preserve"> to be agile and strong</w:t>
+      </w:r>
+      <w:r>
+        <w:rPr>
+          <w:lang w:val="en-US"/>
+        </w:rPr>
+        <w:t>.</w:t>
       </w:r>
     </w:p>
     <w:p>
@@ -355,13 +289,25 @@
     </w:p>
     <w:p>
       <w:pPr>
+        <w:rPr>
+          <w:lang w:val="en-US"/>
+        </w:rPr>
+      </w:pPr>
+      <w:r>
+        <w:rPr>
+          <w:lang w:val="en-US"/>
+        </w:rPr>
+        <w:t>Bulk</w:t>
+      </w:r>
+    </w:p>
+    <w:p>
+      <w:pPr>
         <w:pStyle w:val="berschrift2"/>
         <w:rPr>
           <w:lang w:val="en-US"/>
         </w:rPr>
       </w:pPr>
       <w:bookmarkStart w:id="0" w:name="_Hlk234175724"/>
-      <w:proofErr w:type="spellStart"/>
       <w:r>
         <w:rPr>
           <w:lang w:val="en-US"/>
@@ -369,7 +315,6 @@
         <w:lastRenderedPageBreak/>
         <w:t>Kerstice</w:t>
       </w:r>
-      <w:proofErr w:type="spellEnd"/>
     </w:p>
     <w:bookmarkEnd w:id="0"/>
     <w:p>
@@ -392,21 +337,23 @@
           <w:lang w:val="en-US"/>
         </w:rPr>
       </w:pPr>
-      <w:proofErr w:type="spellStart"/>
-      <w:proofErr w:type="gramStart"/>
-      <w:r>
-        <w:rPr>
-          <w:lang w:val="en-US"/>
-        </w:rPr>
-        <w:t>Lets</w:t>
-      </w:r>
-      <w:proofErr w:type="spellEnd"/>
-      <w:proofErr w:type="gramEnd"/>
-      <w:r>
-        <w:rPr>
-          <w:lang w:val="en-US"/>
-        </w:rPr>
-        <w:t xml:space="preserve"> the Harmonist amass and form stone and similar material into shapes of their will.</w:t>
+      <w:r>
+        <w:rPr>
+          <w:lang w:val="en-US"/>
+        </w:rPr>
+        <w:t>Lets the Harmonist amass and form stone and similar material into shapes of their will</w:t>
+      </w:r>
+      <w:r>
+        <w:rPr>
+          <w:lang w:val="en-US"/>
+        </w:rPr>
+        <w:t>, like pillars or sculptures even</w:t>
+      </w:r>
+      <w:r>
+        <w:rPr>
+          <w:lang w:val="en-US"/>
+        </w:rPr>
+        <w:t>.</w:t>
       </w:r>
     </w:p>
     <w:p>
@@ -549,19 +496,44 @@
     </w:p>
     <w:p>
       <w:pPr>
+        <w:pStyle w:val="berschrift3"/>
+        <w:rPr>
+          <w:lang w:val="en-US"/>
+        </w:rPr>
+      </w:pPr>
+      <w:r>
+        <w:rPr>
+          <w:lang w:val="en-US"/>
+        </w:rPr>
+        <w:t>Quake</w:t>
+      </w:r>
+    </w:p>
+    <w:p>
+      <w:pPr>
+        <w:rPr>
+          <w:lang w:val="en-US"/>
+        </w:rPr>
+      </w:pPr>
+      <w:r>
+        <w:rPr>
+          <w:lang w:val="en-US"/>
+        </w:rPr>
+        <w:t>Slamming an appendage into stone creates a strong but small earthquake, shaking up the touched stones and rock</w:t>
+      </w:r>
+    </w:p>
+    <w:p>
+      <w:pPr>
         <w:pStyle w:val="berschrift2"/>
         <w:rPr>
           <w:lang w:val="en-US"/>
         </w:rPr>
       </w:pPr>
-      <w:proofErr w:type="spellStart"/>
       <w:r>
         <w:rPr>
           <w:lang w:val="en-US"/>
         </w:rPr>
         <w:t>Vrastice</w:t>
       </w:r>
-      <w:proofErr w:type="spellEnd"/>
     </w:p>
     <w:p>
       <w:pPr>
@@ -644,14 +616,12 @@
           <w:lang w:val="en-US"/>
         </w:rPr>
       </w:pPr>
-      <w:proofErr w:type="spellStart"/>
       <w:r>
         <w:rPr>
           <w:lang w:val="en-US"/>
         </w:rPr>
         <w:t>Mishstice</w:t>
       </w:r>
-      <w:proofErr w:type="spellEnd"/>
     </w:p>
     <w:p>
       <w:pPr>
@@ -691,6 +661,7 @@
         <w:rPr>
           <w:lang w:val="en-US"/>
         </w:rPr>
+        <w:lastRenderedPageBreak/>
         <w:t>Flow</w:t>
       </w:r>
     </w:p>
@@ -714,15 +685,12 @@
           <w:lang w:val="en-US"/>
         </w:rPr>
       </w:pPr>
-      <w:proofErr w:type="spellStart"/>
-      <w:r>
-        <w:rPr>
-          <w:lang w:val="en-US"/>
-        </w:rPr>
-        <w:lastRenderedPageBreak/>
+      <w:r>
+        <w:rPr>
+          <w:lang w:val="en-US"/>
+        </w:rPr>
         <w:t>Tristice</w:t>
       </w:r>
-      <w:proofErr w:type="spellEnd"/>
     </w:p>
     <w:p>
       <w:pPr>
@@ -780,56 +748,71 @@
     </w:p>
     <w:p>
       <w:pPr>
+        <w:pStyle w:val="berschrift3"/>
+        <w:rPr>
+          <w:lang w:val="en-US"/>
+        </w:rPr>
+      </w:pPr>
+      <w:r>
+        <w:rPr>
+          <w:lang w:val="en-US"/>
+        </w:rPr>
+        <w:t>Whip</w:t>
+      </w:r>
+    </w:p>
+    <w:p>
+      <w:pPr>
+        <w:rPr>
+          <w:lang w:val="en-US"/>
+        </w:rPr>
+      </w:pPr>
+      <w:r>
+        <w:rPr>
+          <w:lang w:val="en-US"/>
+        </w:rPr>
+        <w:t>Creates a whip from nothing. Easier controlled by a stick or specialized tool for the Melody. Can be controlled like a tentacle.</w:t>
+      </w:r>
+    </w:p>
+    <w:p>
+      <w:pPr>
         <w:pStyle w:val="berschrift2"/>
         <w:rPr>
           <w:lang w:val="en-US"/>
         </w:rPr>
       </w:pPr>
-      <w:proofErr w:type="spellStart"/>
       <w:r>
         <w:rPr>
           <w:lang w:val="en-US"/>
         </w:rPr>
         <w:t>Vaostice</w:t>
       </w:r>
-      <w:proofErr w:type="spellEnd"/>
-    </w:p>
-    <w:p>
-      <w:pPr>
-        <w:pStyle w:val="berschrift3"/>
-        <w:rPr>
-          <w:lang w:val="en-US"/>
-        </w:rPr>
-      </w:pPr>
-      <w:proofErr w:type="spellStart"/>
+    </w:p>
+    <w:p>
+      <w:pPr>
+        <w:pStyle w:val="berschrift3"/>
+        <w:rPr>
+          <w:lang w:val="en-US"/>
+        </w:rPr>
+      </w:pPr>
       <w:r>
         <w:rPr>
           <w:lang w:val="en-US"/>
         </w:rPr>
         <w:t>Shkarhound</w:t>
       </w:r>
-      <w:proofErr w:type="spellEnd"/>
-    </w:p>
-    <w:p>
-      <w:pPr>
-        <w:rPr>
-          <w:lang w:val="en-US"/>
-        </w:rPr>
-      </w:pPr>
-      <w:r>
-        <w:rPr>
-          <w:lang w:val="en-US"/>
-        </w:rPr>
-        <w:t xml:space="preserve">Transformation into a </w:t>
-      </w:r>
-      <w:proofErr w:type="spellStart"/>
-      <w:r>
-        <w:rPr>
-          <w:lang w:val="en-US"/>
-        </w:rPr>
-        <w:t>Shkarhound</w:t>
-      </w:r>
-      <w:proofErr w:type="spellEnd"/>
+    </w:p>
+    <w:p>
+      <w:pPr>
+        <w:rPr>
+          <w:lang w:val="en-US"/>
+        </w:rPr>
+      </w:pPr>
+      <w:r>
+        <w:rPr>
+          <w:lang w:val="en-US"/>
+        </w:rPr>
+        <w:t>Transformation into a Shkarhound</w:t>
+      </w:r>
     </w:p>
     <w:p>
       <w:pPr>
@@ -865,14 +848,12 @@
           <w:lang w:val="en-US"/>
         </w:rPr>
       </w:pPr>
-      <w:proofErr w:type="spellStart"/>
       <w:r>
         <w:rPr>
           <w:lang w:val="en-US"/>
         </w:rPr>
         <w:t>Rustice</w:t>
       </w:r>
-      <w:proofErr w:type="spellEnd"/>
     </w:p>
     <w:p>
       <w:pPr>
@@ -899,6 +880,59 @@
           <w:lang w:val="en-US"/>
         </w:rPr>
         <w:t>Creates a blast of wind that can be directed anywhere. Has lots of powers that is quickly lost over 10-20 meters.</w:t>
+      </w:r>
+    </w:p>
+    <w:p>
+      <w:pPr>
+        <w:pStyle w:val="berschrift2"/>
+        <w:rPr>
+          <w:lang w:val="en-US"/>
+        </w:rPr>
+      </w:pPr>
+      <w:r>
+        <w:rPr>
+          <w:lang w:val="en-US"/>
+        </w:rPr>
+        <w:t>Nelstice</w:t>
+      </w:r>
+    </w:p>
+    <w:p>
+      <w:pPr>
+        <w:pStyle w:val="berschrift3"/>
+        <w:rPr>
+          <w:lang w:val="en-US"/>
+        </w:rPr>
+      </w:pPr>
+      <w:r>
+        <w:rPr>
+          <w:lang w:val="en-US"/>
+        </w:rPr>
+        <w:t>Casing</w:t>
+      </w:r>
+    </w:p>
+    <w:p>
+      <w:pPr>
+        <w:rPr>
+          <w:lang w:val="en-US"/>
+        </w:rPr>
+      </w:pPr>
+      <w:r>
+        <w:rPr>
+          <w:lang w:val="en-US"/>
+        </w:rPr>
+        <w:t>Forms a</w:t>
+      </w:r>
+      <w:r>
+        <w:rPr>
+          <w:lang w:val="en-US"/>
+        </w:rPr>
+        <w:t xml:space="preserve"> living</w:t>
+      </w:r>
+      <w:r>
+        <w:rPr>
+          <w:lang w:val="en-US"/>
+        </w:rPr>
+        <w:t xml:space="preserve"> armor of bark and roots around the Harmonist, increasing their defense and strengthening their body through the power granted by additional plant like muscles.</w:t>
       </w:r>
     </w:p>
     <w:p>

</xml_diff>